<commit_message>
Fix some transitions, start implementing item system
</commit_message>
<xml_diff>
--- a/design/items/items-and-crafting.docx
+++ b/design/items/items-and-crafting.docx
@@ -3787,16 +3787,16 @@
         <w:rPr>
           <w:u w:val="single"/>
         </w:rPr>
-        <w:t>Metal</w:t>
-      </w:r>
-      <w:r>
-        <w:rPr>
-          <w:u w:val="single"/>
-        </w:rPr>
-        <w:t xml:space="preserve"> Scrap</w:t>
-      </w:r>
-      <w:r>
-        <w:t>: Crude but strong, could be melted down and reshaped.</w:t>
+        <w:t>Scrap</w:t>
+      </w:r>
+      <w:r>
+        <w:t>: Crude but strong</w:t>
+      </w:r>
+      <w:r>
+        <w:t xml:space="preserve"> metal</w:t>
+      </w:r>
+      <w:r>
+        <w:t>, could be melted down and reshaped.</w:t>
       </w:r>
     </w:p>
     <w:p>

</xml_diff>